<commit_message>
Update architecture doc for Legacy Mesh; add session handoff briefing
docx section 9: correct the now-stale TronGrid registry description in
9.5, add the Legacy Mesh Hop-1-read-as-final bug as a 5th live-testing
finding in 9.6, document the MAX_BRIDGE_HOPS limitation in 9.8, and add
9.10 explaining the Hop 2 compose mechanism plus the two independent hop
counters (MAX_BRIDGE_HOPS vs max_hops).

briefing_for_claude_code.md: handoff doc for a future session - current
state, the five bugs found and fixed this session, known-but-unfixed gaps
(tron_adapter.get_transaction_info() likely hitting a dead TronGrid
endpoint, chains.yaml missing XLayer), and what's not started (Layer 2
wrappers).

Co-Authored-By: Claude Sonnet 5 <noreply@anthropic.com>
</commit_message>
<xml_diff>
--- a/BitOK_bridge_tracer_architecture.docx
+++ b/BitOK_bridge_tracer_architecture.docx
@@ -2519,7 +2519,7 @@
           <w:sz w:val="22"/>
           <w:szCs w:val="22"/>
         </w:rPr>
-        <w:t xml:space="preserve">В дополнение к архитектурному описанию реализован рабочий MVP-трейсер для случая из раздела 5.1 — message-passing моста LayerZero (V2), через который работает USDT0 — основной канал переводов USDT между TRON и EVM-сетями в 2026 году. Изначально (9.1–9.4) MVP сопоставлял только сам факт пересечения моста — вход и выход; позже (9.5–9.9) он расширен до полного пути транзакции: от адреса/tx на Tron через мост до точки, где трейс останавливается на целевой EVM-сети (bridge_tracer.py, единая точка входа trace_full_path()). Остальные типы мостов (Wormhole, liquidity-pool, intent-based) в MVP не реализовывались — по объёму работы каждый требует отдельного адаптера с принципиально другой механикой сопоставления, что подробно расписано в разделе 5.</w:t>
+        <w:t xml:space="preserve">В дополнение к архитектурному описанию реализован рабочий MVP-трейсер для случая из раздела 5.1 — message-passing моста LayerZero (V2), через который работает USDT0 — основной канал переводов USDT между TRON и EVM-сетями в 2026 году. Изначально (9.1–9.4) MVP сопоставлял только сам факт пересечения моста — вход и выход; позже (9.5–9.10) он расширен до полного пути транзакции: от адреса/tx на Tron через мост до точки, где трейс останавливается на целевой EVM-сети (bridge_tracer.py, единая точка входа trace_full_path()). Остальные типы мостов (Wormhole, liquidity-pool, intent-based) в MVP не реализовывались — по объёму работы каждый требует отдельного адаптера с принципиально другой механикой сопоставления, что подробно расписано в разделе 5.</w:t>
       </w:r>
     </w:p>
     <w:p>
@@ -2746,7 +2746,7 @@
           <w:sz w:val="22"/>
           <w:szCs w:val="22"/>
         </w:rPr>
-        <w:t xml:space="preserve">LayerZero Scan, messages/wallet (layerzero_tracer.find_messages_by_wallet) — от Tron-адреса отправителя напрямую спрашиваем у LayerZero Scan, какие сообщения он реально отправил, вместо того чтобы угадывать депозит по TronGrid (см. 9.6 — первая версия на TronGrid-эвристике давала ложноотрицательный результат при переводе через промежуточный router-контракт). Фильтр по pathway.sender.address по-прежнему держит TRON_BRIDGE_DEPOSIT_CONTRACTS (на сегодня один адрес, USDT0 OFT на Tron mainnet) — не как эвристику поиска депозита, а как scope-фильтр «это сообщение через известный нам OApp».</w:t>
+        <w:t xml:space="preserve">LayerZero Scan, messages/wallet (layerzero_tracer.find_messages_by_wallet) — от Tron-адреса отправителя напрямую спрашиваем у LayerZero Scan, какие сообщения он реально отправил, вместо того чтобы угадывать депозит по TronGrid (см. 9.6 — первая версия на TronGrid-эвристике давала ложноотрицательный результат при переводе через промежуточный router-контракт). Фильтр по pathway.sender.address держит реестр известных Tron-OApp — больше не захардкожен, а получается живым запросом (с диск-кэшем на 24 часа) к официальному USDT0 Deployments API (usdt0_deployments.py, docs.usdt0.to/api/deployments) — не как эвристику поиска депозита, а как scope-фильтр «это сообщение через известный нам OApp».</w:t>
       </w:r>
     </w:p>
     <w:p>
@@ -2764,7 +2764,7 @@
           <w:sz w:val="22"/>
           <w:szCs w:val="22"/>
         </w:rPr>
-        <w:t xml:space="preserve">LayerZero Scan (layerzero_tracer.find_bridge_crossing) — тот же сопоставитель входа/выхода моста из разделов 9.1–9.4, логика сопоставления не менялась (что поменялось — см. 9.6).</w:t>
+        <w:t xml:space="preserve">LayerZero Scan (layerzero_tracer.find_bridge_crossing) — тот же сопоставитель входа/выхода моста из разделов 9.1–9.4, но теперь может дочитывать до MAX_BRIDGE_HOPS сообщений подряд для Legacy Mesh (USDT0 Transfer Hub через Arbitrum как хаб) — см. 9.10.</w:t>
       </w:r>
     </w:p>
     <w:p>
@@ -2825,7 +2825,7 @@
           <w:sz w:val="22"/>
           <w:szCs w:val="22"/>
         </w:rPr>
-        <w:t xml:space="preserve">Брифинг явно просил сначала прогнать layerzero_tracer.py на живом tx hash, а не полагаться только на офлайн-тесты на синтетических данных — живая проверка (включая повторную проверку на независимо найденном пользователем адресе) нашла четыре реальных несоответствия, все исправлены до сдачи:</w:t>
+        <w:t xml:space="preserve">Брифинг явно просил сначала прогнать layerzero_tracer.py на живом tx hash, а не полагаться только на офлайн-тесты на синтетических данных — живая проверка (включая повторную проверку на независимо найденном пользователем адресе) нашла пять реальных несоответствий, все исправлены до сдачи:</w:t>
       </w:r>
     </w:p>
     <w:p>
@@ -2902,53 +2902,6 @@
     </w:p>
     <w:p>
       <w:pPr>
-        <w:pStyle w:val="Heading2"/>
-        <w:spacing w:after="120" w:before="260"/>
-      </w:pPr>
-      <w:r>
-        <w:rPr>
-          <w:rFonts w:ascii="Calibri" w:cs="Calibri" w:eastAsia="Calibri" w:hAnsi="Calibri"/>
-          <w:b/>
-          <w:bCs/>
-          <w:color w:val="1F4E5F"/>
-          <w:sz w:val="24"/>
-          <w:szCs w:val="24"/>
-        </w:rPr>
-        <w:t xml:space="preserve">9.7 Стоп-условия и реестр меток (known_contracts.py)</w:t>
-      </w:r>
-    </w:p>
-    <w:p>
-      <w:pPr>
-        <w:spacing w:after="160" w:line="276"/>
-      </w:pPr>
-      <w:r>
-        <w:rPr>
-          <w:rFonts w:ascii="Calibri" w:cs="Calibri" w:eastAsia="Calibri" w:hAnsi="Calibri"/>
-          <w:sz w:val="22"/>
-          <w:szCs w:val="22"/>
-        </w:rPr>
-        <w:t xml:space="preserve">Реестр по духу совпадает с Bridge Contract Registry из раздела 3, только для «любого известного типа контракта», не только мостов: адрес → (тип: exchange / dex_swap / bridge, название). Для MVP заполнен вручную на 6 адресов (два хот-кошелька Binance, Coinbase, Uniswap Universal Router, Uniswap V3 Router, Wormhole Portal Token Bridge — все на Ethereum mainnet) — каждый сверен живым поиском по публичным меткам Etherscan, а не взят по памяти (тот же принцип, что и для реестра LayerZero eid в разделе 9.1). Это заведомо не production-полнота, а демонстрация принципа: трейсер останавливается на любом известном адресе (RESTED_AT_EXCHANGE для бирж, RESTED_AT_CONTRACT для DEX/другого моста), не пытаясь резолвить сам своп или следующий переход — это отдельная, более объёмная задача (см. 5.2, 7).</w:t>
-      </w:r>
-    </w:p>
-    <w:p>
-      <w:pPr>
-        <w:pStyle w:val="Heading2"/>
-        <w:spacing w:after="120" w:before="260"/>
-      </w:pPr>
-      <w:r>
-        <w:rPr>
-          <w:rFonts w:ascii="Calibri" w:cs="Calibri" w:eastAsia="Calibri" w:hAnsi="Calibri"/>
-          <w:b/>
-          <w:bCs/>
-          <w:color w:val="1F4E5F"/>
-          <w:sz w:val="24"/>
-          <w:szCs w:val="24"/>
-        </w:rPr>
-        <w:t xml:space="preserve">9.8 Ограничения расширенного MVP</w:t>
-      </w:r>
-    </w:p>
-    <w:p>
-      <w:pPr>
         <w:pStyle w:val="ListParagraph"/>
         <w:numPr>
           <w:ilvl w:val="0"/>
@@ -2962,7 +2915,54 @@
           <w:sz w:val="22"/>
           <w:szCs w:val="22"/>
         </w:rPr>
-        <w:t xml:space="preserve">TronGrid-сегмент распознаёт депозит в мост только по статическому реестру (сейчас — один адрес, USDT0 OFT); перевод на bridge-контракт вне этого реестра трейсер не найдёт.</w:t>
+        <w:t xml:space="preserve">Hop 1 из 2 читался как финальный выход из моста (Legacy Mesh). USDT0 Transfer Hub может маршрутизировать перевод через Arbitrum как промежуточный хаб: Hop 1 (source → Arbitrum, конвертация в USDT0 через liquidity-pool) и, если сработал LayerZero-механизм compose, Hop 2 (Arbitrum → реальная целевая сеть через OFT mint/burn) — это не всегда очевидно из самого сообщения Hop 1. Подтверждено живыми данными (включая реальные переводы С TRON, не только гипотетически): destination.lzCompose в ответе API — «N/A», если Hop 2 нет, или {"status": "SUCCEEDED", "txs": [...]}, если он состоялся — и указанный там txHash сам резолвится как полноценное отдельное сообщение LayerZero. Без этой проверки трейсер останавливался на хабе как на финальной точке. Исправлено: find_bridge_crossing() теперь возвращает compose_status/compose_tx_hash, а trace_full_path() дочитывает цепочку — см. 9.10.</w:t>
+      </w:r>
+    </w:p>
+    <w:p>
+      <w:pPr>
+        <w:pStyle w:val="Heading2"/>
+        <w:spacing w:after="120" w:before="260"/>
+      </w:pPr>
+      <w:r>
+        <w:rPr>
+          <w:rFonts w:ascii="Calibri" w:cs="Calibri" w:eastAsia="Calibri" w:hAnsi="Calibri"/>
+          <w:b/>
+          <w:bCs/>
+          <w:color w:val="1F4E5F"/>
+          <w:sz w:val="24"/>
+          <w:szCs w:val="24"/>
+        </w:rPr>
+        <w:t xml:space="preserve">9.7 Стоп-условия и реестр меток (known_contracts.py)</w:t>
+      </w:r>
+    </w:p>
+    <w:p>
+      <w:pPr>
+        <w:spacing w:after="160" w:line="276"/>
+      </w:pPr>
+      <w:r>
+        <w:rPr>
+          <w:rFonts w:ascii="Calibri" w:cs="Calibri" w:eastAsia="Calibri" w:hAnsi="Calibri"/>
+          <w:sz w:val="22"/>
+          <w:szCs w:val="22"/>
+        </w:rPr>
+        <w:t xml:space="preserve">Реестр по духу совпадает с Bridge Contract Registry из раздела 3, только для «любого известного типа контракта», не только мостов: адрес → (тип: exchange / dex_swap / bridge, название). Для MVP заполнен вручную на 6 адресов (два хот-кошелька Binance, Coinbase, Uniswap Universal Router, Uniswap V3 Router, Wormhole Portal Token Bridge — все на Ethereum mainnet) — каждый сверен живым поиском по публичным меткам Etherscan, а не взят по памяти (тот же принцип, что и для реестра LayerZero eid в разделе 9.1). Это заведомо не production-полнота, а демонстрация принципа: трейсер останавливается на любом известном адресе (RESTED_AT_EXCHANGE для бирж, RESTED_AT_CONTRACT для DEX/другого моста), не пытаясь резолвить сам своп или следующий переход — это отдельная, более объёмная задача (см. 5.2, 7).</w:t>
+      </w:r>
+    </w:p>
+    <w:p>
+      <w:pPr>
+        <w:pStyle w:val="Heading2"/>
+        <w:spacing w:after="120" w:before="260"/>
+      </w:pPr>
+      <w:r>
+        <w:rPr>
+          <w:rFonts w:ascii="Calibri" w:cs="Calibri" w:eastAsia="Calibri" w:hAnsi="Calibri"/>
+          <w:b/>
+          <w:bCs/>
+          <w:color w:val="1F4E5F"/>
+          <w:sz w:val="24"/>
+          <w:szCs w:val="24"/>
+        </w:rPr>
+        <w:t xml:space="preserve">9.8 Ограничения расширенного MVP</w:t>
       </w:r>
     </w:p>
     <w:p>
@@ -2980,7 +2980,7 @@
           <w:sz w:val="22"/>
           <w:szCs w:val="22"/>
         </w:rPr>
-        <w:t xml:space="preserve">Пост-bridge обход на EVM — не amount-aware taint-трейсинг: один хоп = самый ранний подходящий по времени перевод в пределах одной страницы Blockscout (до 50 переводов); при очень высокой активности адреса релевантный перевод может не попасть на страницу, и трейс ошибочно прочитается как тупик.</w:t>
+        <w:t xml:space="preserve">Обнаружение депозита по-прежнему ограничено реестром известных Tron-OApp (сейчас — один: USDT0 OFT на Tron) — теперь живым (см. 9.5), но всё ещё явным фильтром; сообщение через OApp/протокол вне этого списка трейсер не найдёт.</w:t>
       </w:r>
     </w:p>
     <w:p>
@@ -2998,7 +2998,7 @@
           <w:sz w:val="22"/>
           <w:szCs w:val="22"/>
         </w:rPr>
-        <w:t xml:space="preserve">Второй мост или DEX-своп на пути не резолвится — трейсер корректно останавливается, а не идёт дальше (см. 5.2).</w:t>
+        <w:t xml:space="preserve">Пост-bridge обход на EVM — не amount-aware taint-трейсинг: один хоп = самый ранний подходящий по времени перевод в пределах одной страницы Blockscout (до 50 переводов); при очень высокой активности адреса релевантный перевод может не попасть на страницу, и трейс ошибочно прочитается как тупик.</w:t>
       </w:r>
     </w:p>
     <w:p>
@@ -3016,7 +3016,43 @@
           <w:sz w:val="22"/>
           <w:szCs w:val="22"/>
         </w:rPr>
-        <w:t xml:space="preserve">Сегмент evm_adapter требует платного BLOCKSCOUT_API_KEY, которого не было на момент этой проверки — логика подтверждена на реальных данных через бесплатный публичный Blockscout API (та же v2-схема ответов), но не против самого Blockscout Pro endpoint.</w:t>
+        <w:t xml:space="preserve">Второй мост или DEX-своп на пути не резолвится — трейсер корректно останавливается, а не идёт дальше (см. 5.2).</w:t>
+      </w:r>
+    </w:p>
+    <w:p>
+      <w:pPr>
+        <w:pStyle w:val="ListParagraph"/>
+        <w:numPr>
+          <w:ilvl w:val="0"/>
+          <w:numId w:val="2"/>
+        </w:numPr>
+        <w:spacing w:after="90" w:line="276"/>
+      </w:pPr>
+      <w:r>
+        <w:rPr>
+          <w:rFonts w:ascii="Calibri" w:cs="Calibri" w:eastAsia="Calibri" w:hAnsi="Calibri"/>
+          <w:sz w:val="22"/>
+          <w:szCs w:val="22"/>
+        </w:rPr>
+        <w:t xml:space="preserve">Сегмент evm_adapter требует платного BLOCKSCOUT_API_KEY, которого не было на момент этой проверки — логика подтверждена на реальных данных через бесплатный публичный Blockscout API (та же v2-схема ответов) и позже — против настоящего Blockscout Pro endpoint с платным ключом.</w:t>
+      </w:r>
+    </w:p>
+    <w:p>
+      <w:pPr>
+        <w:pStyle w:val="ListParagraph"/>
+        <w:numPr>
+          <w:ilvl w:val="0"/>
+          <w:numId w:val="2"/>
+        </w:numPr>
+        <w:spacing w:after="90" w:line="276"/>
+      </w:pPr>
+      <w:r>
+        <w:rPr>
+          <w:rFonts w:ascii="Calibri" w:cs="Calibri" w:eastAsia="Calibri" w:hAnsi="Calibri"/>
+          <w:sz w:val="22"/>
+          <w:szCs w:val="22"/>
+        </w:rPr>
+        <w:t xml:space="preserve">MAX_BRIDGE_HOPS = 3 — защитный предел на цепочку сообщений LayerZero подряд при дочитывании Legacy Mesh (документирован ровно как 2 хопа; запас чисто защитный, не наблюдаемое на практике значение). Это ОТДЕЛЬНЫЙ счётчик от max_hops (глубина пост-bridge обхода на EVM после финального выхода из моста, по умолчанию 10) — разные переменные, разные циклы в разных функциях (trace_full_path vs _walk_evm), не путаются друг с другом ни в коде, ни в hops[] результата (разные ключи — «leg» для мостовых хопов, «hop_number» для EVM) — см. 9.10.</w:t>
       </w:r>
     </w:p>
     <w:p>
@@ -3047,6 +3083,124 @@
           <w:szCs w:val="22"/>
         </w:rPr>
         <w:t xml:space="preserve">python3 bridge_tracer.py --start &lt;Tron-адрес&gt; [--start-type address|tx_hash] [--max-hops N]. В этой сессии прогнан на реальном адресе TMKcUby8aLqumtBMvwV66JmLLhcE3878r8: найден депозит в USDT0 OFT на Tron → сопоставлен реальный переход на Ethereum (GUID 0x22a545ed…, DELIVERED) → пост-bridge обход дошёл до предполагаемого DEX/арбитраж-контракта и корректно остановился (RESTED_AT_CONTRACT). Офлайн-покрытие — test_bridge_tracer.py, 10 сценариев (все статусы выше плюс страховка от зацикливания на свопе и пропуск TronGrid-шага при start_type=tx_hash).</w:t>
+      </w:r>
+    </w:p>
+    <w:p>
+      <w:pPr>
+        <w:pStyle w:val="Heading2"/>
+        <w:spacing w:after="120" w:before="260"/>
+      </w:pPr>
+      <w:r>
+        <w:rPr>
+          <w:rFonts w:ascii="Calibri" w:cs="Calibri" w:eastAsia="Calibri" w:hAnsi="Calibri"/>
+          <w:b/>
+          <w:bCs/>
+          <w:color w:val="1F4E5F"/>
+          <w:sz w:val="24"/>
+          <w:szCs w:val="24"/>
+        </w:rPr>
+        <w:t xml:space="preserve">9.10 Legacy Mesh: Hop 2 через compose</w:t>
+      </w:r>
+    </w:p>
+    <w:p>
+      <w:pPr>
+        <w:spacing w:after="160" w:line="276"/>
+      </w:pPr>
+      <w:r>
+        <w:rPr>
+          <w:rFonts w:ascii="Calibri" w:cs="Calibri" w:eastAsia="Calibri" w:hAnsi="Calibri"/>
+          <w:sz w:val="22"/>
+          <w:szCs w:val="22"/>
+        </w:rPr>
+        <w:t xml:space="preserve">USDT0 Transfer Hub (Legacy Mesh) для сетей вроде Tron может маршрутизировать перевод не одним сообщением LayerZero, а двумя подряд, с Arbitrum как общим хабом: Hop 1 (source-сеть → Arbitrum, конвертация в USDT0 через liquidity-pool) и, если пользователь выбрал конечную сеть, отличную от Arbitrum, Hop 2 (Arbitrum → реальная целевая сеть через обычный OFT mint/burn). Hop 2 запускается автоматически встроенным механизмом LayerZero V2 «compose»: OFT-сообщение Hop 1 несёт не только перевод, но и инструкцию вызвать Composer-контракт на хабе сразу после доставки — тот сам инициирует Hop 2 как полноценное отдельное сообщение LayerZero, без участия пользователя.</w:t>
+      </w:r>
+    </w:p>
+    <w:p>
+      <w:pPr>
+        <w:spacing w:after="160" w:line="276"/>
+      </w:pPr>
+      <w:r>
+        <w:rPr>
+          <w:rFonts w:ascii="Calibri" w:cs="Calibri" w:eastAsia="Calibri" w:hAnsi="Calibri"/>
+          <w:sz w:val="22"/>
+          <w:szCs w:val="22"/>
+        </w:rPr>
+        <w:t xml:space="preserve">Обнаружение (find_bridge_crossing() в layerzero_tracer.py): destination.lzCompose в сыром ответе LayerZero Scan — {"status": "N/A"}, если Hop 2 не запускался (сообщение было обычным SEND, хаб — финальная точка), либо {"status": "SUCCEEDED", "txs": [{"txHash": ...}]}, если compose исполнился — и это txHash сам по себе успешно резолвится через тот же find_bridge_crossing() как независимое сообщение Hop 2. Подтверждено на реальных данных: отсканирован реестр сообщений OApp USDT0-на-Tron (~500 сообщений с Tron как source) — среди них нашлось 30 настоящих composed-переводов Tron → Arbitrum → дальше (xlayer, Polygon и другие сети), прогнанных через find_bridge_crossing() и, для одного из них, через полный trace_full_path() на настоящем Tron-адресе отправителя.</w:t>
+      </w:r>
+    </w:p>
+    <w:p>
+      <w:pPr>
+        <w:spacing w:after="160" w:line="276"/>
+      </w:pPr>
+      <w:r>
+        <w:rPr>
+          <w:rFonts w:ascii="Calibri" w:cs="Calibri" w:eastAsia="Calibri" w:hAnsi="Calibri"/>
+          <w:sz w:val="22"/>
+          <w:szCs w:val="22"/>
+        </w:rPr>
+        <w:t xml:space="preserve">trace_full_path() в bridge_tracer.py дочитывает цепочку в цикле: получает crossing, записывает его как очередной хоп сегмента «bridge» (с номером leg), и если у него есть compose_tx_hash — повторяет find_bridge_crossing() уже на этом хэше, вместо того чтобы считать текущую bridge_exit финальной точкой выхода из моста.</w:t>
+      </w:r>
+    </w:p>
+    <w:p>
+      <w:pPr>
+        <w:spacing w:after="160" w:line="276"/>
+      </w:pPr>
+      <w:r>
+        <w:rPr>
+          <w:rFonts w:ascii="Calibri" w:cs="Calibri" w:eastAsia="Calibri" w:hAnsi="Calibri"/>
+          <w:sz w:val="22"/>
+          <w:szCs w:val="22"/>
+        </w:rPr>
+        <w:t xml:space="preserve">Два независимых счётчика хопов — не путать. У трейсера два разных предела глубины обхода, для двух разных сегментов пути, которые не делят между собой ни переменную, ни цикл, ни ключ в результате:</w:t>
+      </w:r>
+    </w:p>
+    <w:p>
+      <w:pPr>
+        <w:pStyle w:val="ListParagraph"/>
+        <w:numPr>
+          <w:ilvl w:val="0"/>
+          <w:numId w:val="2"/>
+        </w:numPr>
+        <w:spacing w:after="90" w:line="276"/>
+      </w:pPr>
+      <w:r>
+        <w:rPr>
+          <w:rFonts w:ascii="Calibri" w:cs="Calibri" w:eastAsia="Calibri" w:hAnsi="Calibri"/>
+          <w:sz w:val="22"/>
+          <w:szCs w:val="22"/>
+        </w:rPr>
+        <w:t xml:space="preserve">MAX_BRIDGE_HOPS = 3 — константа модуля (не параметр, не переопределяется вызывающим кодом), предел на цепочку сообщений LayerZero подряд (Hop 1, Hop 2, ...) в отдельном цикле внутри trace_full_path(). Legacy Mesh документирован ровно как 2 хопа — запас чисто защитный, чтобы не зациклиться на аномальных данных, а не наблюдаемое на практике значение. Хопы этого цикла попадают в hops[] с ключом segment="bridge" и полем "leg".</w:t>
+      </w:r>
+    </w:p>
+    <w:p>
+      <w:pPr>
+        <w:pStyle w:val="ListParagraph"/>
+        <w:numPr>
+          <w:ilvl w:val="0"/>
+          <w:numId w:val="2"/>
+        </w:numPr>
+        <w:spacing w:after="90" w:line="276"/>
+      </w:pPr>
+      <w:r>
+        <w:rPr>
+          <w:rFonts w:ascii="Calibri" w:cs="Calibri" w:eastAsia="Calibri" w:hAnsi="Calibri"/>
+          <w:sz w:val="22"/>
+          <w:szCs w:val="22"/>
+        </w:rPr>
+        <w:t xml:space="preserve">max_hops (по умолчанию 10, DEFAULT_MAX_HOPS) — параметр, который явно передаёт вызывающий код (CLI --max-hops или trace_full_path(..., max_hops=N)); предел на обычный пост-bridge обход исходящих ERC-20-переводов на EVM-сети, в отдельном цикле внутри _walk_evm() — совершенно другой функции, которая вызывается ПОСЛЕ того, как цикл по мостовым хопам уже полностью завершился. Эти хопы попадают в hops[] с ключом segment="evm_hop" и полем "hop_number".</w:t>
+      </w:r>
+    </w:p>
+    <w:p>
+      <w:pPr>
+        <w:spacing w:after="160" w:line="276"/>
+      </w:pPr>
+      <w:r>
+        <w:rPr>
+          <w:rFonts w:ascii="Calibri" w:cs="Calibri" w:eastAsia="Calibri" w:hAnsi="Calibri"/>
+          <w:sz w:val="22"/>
+          <w:szCs w:val="22"/>
+        </w:rPr>
+        <w:t xml:space="preserve">Поскольку это две разные переменные в двух разных функциях с разными ключами в результате, перепутать их в коде или в выводе не может ни трейсер, ни человек, читающий hops[] — покрыто отдельными тестами (test_full_path_max_hops_reached — для max_hops, test_bridge_hop_chase_capped_at_max_bridge_hops — для MAX_BRIDGE_HOPS, оба в test_bridge_tracer.py).</w:t>
       </w:r>
     </w:p>
     <w:sectPr>

</xml_diff>

<commit_message>
Add multi-page search with registry-based early stop in _walk_evm
Replace single-page lookup with cursor-based pagination (soft cap,
default 4 pages, configurable). Early stop now checks only the one
candidate selected by the existing time-anchoring heuristic against
the known-address registry — not all candidates on a page — so the
"earliest after arrival" logic is never overridden by registry
convenience. Add explicit SEARCH_DEPTH_EXCEEDED status, distinct
from RESTED_AT_ADDRESS, for the case where the page cap is hit
without a match.

Found and documented a real limitation during live re-verification:
for high-frequency intermediate addresses, the "earliest candidate"
result depends on when the tracer runs relative to fund arrival,
since a busy enough address can drift the target transfer beyond
any fixed page cap over time. Not fixable by raising the cap alone.

Tests: 110 -> 114.

Co-Authored-By: Claude Sonnet 5 <noreply@anthropic.com>
</commit_message>
<xml_diff>
--- a/BitOK_bridge_tracer_architecture.docx
+++ b/BitOK_bridge_tracer_architecture.docx
@@ -3338,7 +3338,7 @@
           <w:sz w:val="22"/>
           <w:szCs w:val="22"/>
         </w:rPr>
-        <w:t xml:space="preserve">Известный баг Blockscout Pro (HTTP 500 на token-transfers для адреса 0x6ba10300f0dc58b7a1e4c0e41f5dabb7d7829e13, см. брифинг) переподтверждён живым запуском на примере #17 из 9.11 (Legacy Mesh Hop 2 на Polygon) — bridge_tracer.py намеренно НЕ проглатывает эту ошибку (Layer 1 пробрасывает ошибки нижележащих адаптеров как есть), исключение распространяется вызывающему коду без искажения результата — по дизайну, не регрессия.</w:t>
+        <w:t>Ошибка Blockscout Pro (HTTP 500/timeout на token-transfers для адреса 0x6ba10300f0dc58b7a1e4c0e41f5dabb7d7829e13, см. брифинг) переподтверждена живым запуском на примере #17 из 9.11 (Legacy Mesh Hop 2 на Polygon) — bridge_tracer.py намеренно НЕ проглатывает эту ошибку (Layer 1 пробрасывает ошибки нижележащих адаптеров как есть), исключение распространяется вызывающему коду без искажения результата — по дизайну, не регрессия. Формулировка причины УТОЧНЕНА отдельной проверкой — см. 9.13: это не специфика этого одного адреса и не функция объёма его данных.</w:t>
       </w:r>
     </w:p>
     <w:p>
@@ -3378,6 +3378,118 @@
           <w:szCs w:val="22"/>
         </w:rPr>
         <w:t xml:space="preserve">Тесты выросли с 20 до 21 в test_bridge_tracer.py (105 → 110 в целом по репозиторию).</w:t>
+      </w:r>
+    </w:p>
+    <w:p>
+      <w:pPr>
+        <w:pStyle w:val="Heading2"/>
+        <w:spacing w:after="120" w:before="260"/>
+      </w:pPr>
+      <w:r>
+        <w:rPr>
+          <w:rFonts w:ascii="Calibri" w:cs="Calibri" w:eastAsia="Calibri" w:hAnsi="Calibri"/>
+          <w:b/>
+          <w:bCs/>
+          <w:color w:val="1F4E5F"/>
+          <w:sz w:val="24"/>
+          <w:szCs w:val="24"/>
+        </w:rPr>
+        <w:t xml:space="preserve">9.13 Уточнение: Blockscout Pro на Polygon ненадёжен системно, не для одного адреса</w:t>
+      </w:r>
+    </w:p>
+    <w:p>
+      <w:pPr>
+        <w:spacing w:after="160" w:line="276"/>
+      </w:pPr>
+      <w:r>
+        <w:rPr>
+          <w:rFonts w:ascii="Calibri" w:cs="Calibri" w:eastAsia="Calibri" w:hAnsi="Calibri"/>
+          <w:sz w:val="22"/>
+          <w:szCs w:val="22"/>
+        </w:rPr>
+        <w:t xml:space="preserve">Пользователь усомнился в формулировке 9.12 («похоже, общий Composer-контракт» для объяснения HTTP 500) и попросил разграничить: специфика ли это конкретного адреса, или общая проблема пагинации/объёма данных на высокоактивных адресах. Проверено пятью живыми запросами, не по предположению:</w:t>
+      </w:r>
+    </w:p>
+    <w:p>
+      <w:pPr>
+        <w:spacing w:after="160" w:line="276"/>
+      </w:pPr>
+      <w:r>
+        <w:rPr>
+          <w:rFonts w:ascii="Calibri" w:cs="Calibri" w:eastAsia="Calibri" w:hAnsi="Calibri"/>
+          <w:sz w:val="22"/>
+          <w:szCs w:val="22"/>
+        </w:rPr>
+        <w:t xml:space="preserve">get_token_transfers на ДРУГОМ высокоактивном адресе (Binance hot wallet, 0xF977814e90dA44bFA03b6295A0616a897441aceC) на Polygon — тоже HTTP 500/timeout, включая на лёгком get_address_info (не только token-transfers, значит дело не в самом эндпоинте token-transfers конкретно). Тот же запрос на ПОЧТИ ПУСТОМ burn-адресе (0x000...dEaD) на Polygon — тоже timeout: объём данных адреса явно ни при чём. Тот же Binance-адрес (те же 50+ переводов истории, есть следующая страница) на Ethereum — прошёл чисто с первого запроса, без единой ошибки. Ещё один Polygon-адрес (USDC-контракт) — прошёл, но только со второго раза (после 2 сетевых ретраев клиента).</w:t>
+      </w:r>
+    </w:p>
+    <w:p>
+      <w:pPr>
+        <w:spacing w:after="160" w:line="276"/>
+      </w:pPr>
+      <w:r>
+        <w:rPr>
+          <w:rFonts w:ascii="Calibri" w:cs="Calibri" w:eastAsia="Calibri" w:hAnsi="Calibri"/>
+          <w:sz w:val="22"/>
+          <w:szCs w:val="22"/>
+        </w:rPr>
+        <w:t xml:space="preserve">Вывод: паттерн intermittent (не 100% отказ), не коррелирует ни с конкретным адресом, ни с объёмом его переводов, воспроизводится и на облегчённом эндпоинте — похоже на общую нестабильность именно Polygon-маршрута Blockscout Pro в это время, а не на что-то специфичное для запросов bridge_tracer.py. Не баг адаптера (пагинация _walk_evm здесь ни при чём — ошибка ловится и при limit=1), но риск СИСТЕМНЫЙ (любой запрос на Polygon), а не единичная особенность одного адреса — переформулировано в README.md и брифинге.</w:t>
+      </w:r>
+    </w:p>
+    <w:p>
+      <w:pPr>
+        <w:pStyle w:val="Heading2"/>
+        <w:spacing w:after="120" w:before="260"/>
+      </w:pPr>
+      <w:r>
+        <w:rPr>
+          <w:rFonts w:ascii="Calibri" w:cs="Calibri" w:eastAsia="Calibri" w:hAnsi="Calibri"/>
+          <w:b/>
+          <w:bCs/>
+          <w:color w:val="1F4E5F"/>
+          <w:sz w:val="24"/>
+          <w:szCs w:val="24"/>
+        </w:rPr>
+        <w:t>9.14 Пагинация _walk_evm и generic реестр-чек (known_contracts.py + bridge_registry.py)</w:t>
+      </w:r>
+    </w:p>
+    <w:p>
+      <w:pPr>
+        <w:spacing w:after="160" w:line="276"/>
+      </w:pPr>
+      <w:r>
+        <w:rPr>
+          <w:rFonts w:ascii="Calibri" w:cs="Calibri" w:eastAsia="Calibri" w:hAnsi="Calibri"/>
+          <w:sz w:val="22"/>
+          <w:szCs w:val="22"/>
+        </w:rPr>
+        <w:t xml:space="preserve">Пользователь дал развёрнутое ТЗ на доработку пост-bridge обхода: до max_pages_per_hop страниц Blockscout НА ОДИН хоп (параметр с дефолтом 4, не хардкод) вместо жёсткой одной; переход на следующую страницу — только если текущая пуста после time-фильтра, как только найден подходящий кандидат — дальше не запрашиваем. Реестр-чек (known_contracts.py + bridge_registry.get_registry_for_evm_chain_id() — впервые реально используется, раньше был только задел) — против ОДНОГО выбранного time-anchoring кандидата, не против всех кандидатов страницы: earliest всегда побеждает известность адреса, иначе это был бы тот же класс бага, что №7 (тихая неверная остановка не на том адресе).</w:t>
+      </w:r>
+    </w:p>
+    <w:p>
+      <w:pPr>
+        <w:spacing w:after="160" w:line="276"/>
+      </w:pPr>
+      <w:r>
+        <w:rPr>
+          <w:rFonts w:ascii="Calibri" w:cs="Calibri" w:eastAsia="Calibri" w:hAnsi="Calibri"/>
+          <w:sz w:val="22"/>
+          <w:szCs w:val="22"/>
+        </w:rPr>
+        <w:t xml:space="preserve">Новый статус SEARCH_DEPTH_EXCEEDED — отличается от RESTED_AT_ADDRESS: возвращается, когда потолок max_pages_per_hop достигнут, но Blockscout ещё НЕ подтвердил конец данных (next_page_params не пуст на последней просмотренной странице). «Не хватило глубины поиска» — не то же самое, что «дальше правда некуда идти»; тихий ложный тупик хуже честного «не досмотрели».</w:t>
+      </w:r>
+    </w:p>
+    <w:p>
+      <w:pPr>
+        <w:spacing w:after="160" w:line="276"/>
+      </w:pPr>
+      <w:r>
+        <w:rPr>
+          <w:rFonts w:ascii="Calibri" w:cs="Calibri" w:eastAsia="Calibri" w:hAnsi="Calibri"/>
+          <w:sz w:val="22"/>
+          <w:szCs w:val="22"/>
+        </w:rPr>
+        <w:t xml:space="preserve">Обязательная живая проверка (регрессия на уже проверенном адресе) поймала реальный, ранее неявный нюанс: повторный прогон TXSs47LKWcxf4Kq2CgBpmLkcgv2RTFmfkq спустя 4.5 часа дал ДРУГОЙ результат на Hop 2+. Разбор показал: промежуточный адрес 0xc7bBeC68d12a0d1830360F8Ec58fA599bA1b0e9b — контракт с частотой ~1 исходящий ERC-20-перевод каждые 8 секунд; даже 4 страницы (200 записей ≈ 26 минут его собственной активности) не дотягиваются назад до времени прихода средств спустя 4.5 часа. Это НЕ регрессия пагинации, а фундаментальное свойство любого ограниченного по глубине «earliest-after-X» поиска против живого, постоянно растущего датасета — увеличение max_pages_per_hop только отодвигает порог, не устраняет его для патологически активных промежуточных адресов. Задокументировано как известное ограничение.</w:t>
       </w:r>
     </w:p>
     <w:sectPr>

</xml_diff>

<commit_message>
Add observed name tags from TronGrid and Blockscout (informational only)
TronGrid's account_name and Blockscout's name field are populated
in practice (verified live), but both are self-reported by the
contract/account owner at creation/verification time, not a
moderated business category like known_contracts.py entries. Store
them in a separate registry (observed_name_tags.py) for display
alongside trace output, but do not use them as a basis for route
stop conditions (RESTED_AT_EXCHANGE/CONTRACT) — an unverified label
should not be able to halt an AML trace.

Blockscout's public_tags field is empty even for well-known
addresses (checked against Binance 14) and was not usable at all.
Tronscan's API exposes the same account_name as TronGrid, not an
independent source, so no separate client was built for it.

Tests: 114 -> 116.

Co-Authored-By: Claude Sonnet 5 <noreply@anthropic.com>
</commit_message>
<xml_diff>
--- a/BitOK_bridge_tracer_architecture.docx
+++ b/BitOK_bridge_tracer_architecture.docx
@@ -3450,7 +3450,7 @@
           <w:sz w:val="24"/>
           <w:szCs w:val="24"/>
         </w:rPr>
-        <w:t>9.14 Пагинация _walk_evm и generic реестр-чек (known_contracts.py + bridge_registry.py)</w:t>
+        <w:t xml:space="preserve">9.14 Пагинация _walk_evm, generic реестр-чек и informational name tags</w:t>
       </w:r>
     </w:p>
     <w:p>
@@ -3490,6 +3490,32 @@
           <w:szCs w:val="22"/>
         </w:rPr>
         <w:t xml:space="preserve">Обязательная живая проверка (регрессия на уже проверенном адресе) поймала реальный, ранее неявный нюанс: повторный прогон TXSs47LKWcxf4Kq2CgBpmLkcgv2RTFmfkq спустя 4.5 часа дал ДРУГОЙ результат на Hop 2+. Разбор показал: промежуточный адрес 0xc7bBeC68d12a0d1830360F8Ec58fA599bA1b0e9b — контракт с частотой ~1 исходящий ERC-20-перевод каждые 8 секунд; даже 4 страницы (200 записей ≈ 26 минут его собственной активности) не дотягиваются назад до времени прихода средств спустя 4.5 часа. Это НЕ регрессия пагинации, а фундаментальное свойство любого ограниченного по глубине «earliest-after-X» поиска против живого, постоянно растущего датасета — увеличение max_pages_per_hop только отодвигает порог, не устраняет его для патологически активных промежуточных адресов. Задокументировано как известное ограничение.</w:t>
+      </w:r>
+    </w:p>
+    <w:p>
+      <w:pPr>
+        <w:spacing w:after="160" w:line="276"/>
+      </w:pPr>
+      <w:r>
+        <w:rPr>
+          <w:rFonts w:ascii="Calibri" w:cs="Calibri" w:eastAsia="Calibri" w:hAnsi="Calibri"/>
+          <w:sz w:val="22"/>
+          <w:szCs w:val="22"/>
+        </w:rPr>
+        <w:t xml:space="preserve">Отдельно проверено (живым запросом, не по памяти) по трём источникам name tags: Blockscout Pro get_address_info().public_tags — пуст даже у заведомо известных адресов (Binance 14), поле name заполняется ТОЛЬКО для verified-контрактов и даёт имя из Solidity-исходника ('TetherToken', 'UniversalRouter'), не бизнес-категорию. TronGrid get_account_info().account_name (hex-encoded) — реально есть и содержателен: для уже известных bridge_registry-адресов дал 'OftBridge' и 'UsdtOFT' соответственно. Tronscan API (apilist.tronscanapi.com/api/account, ОТДЕЛЬНЫЙ от TronGrid) — своё поле name даёт ТО ЖЕ значение, что и TronGrid account_name (не независимый источник, тот же on-chain источник данных), addressTagLogo/blueTagUrl (официальная 'синяя галочка') — пустые. Отдельный клиент для Tronscan API не реализован — данные дублируют TronGrid, не оправдано ради дублирующей интеграции в MVP.</w:t>
+      </w:r>
+    </w:p>
+    <w:p>
+      <w:pPr>
+        <w:spacing w:after="160" w:line="276"/>
+      </w:pPr>
+      <w:r>
+        <w:rPr>
+          <w:rFonts w:ascii="Calibri" w:cs="Calibri" w:eastAsia="Calibri" w:hAnsi="Calibri"/>
+          <w:sz w:val="22"/>
+          <w:szCs w:val="22"/>
+        </w:rPr>
+        <w:t xml:space="preserve">Write-through реализован (новый модуль observed_name_tags.py, персистентный JSON-кэш, поля observed_name/observed_name_source в результате trace_full_path()), но осознанно НЕ используется как основание стоп-условия (RESTED_AT_EXCHANGE/CONTRACT) — самоуказанное имя (TronGrid account_name, Blockscout verified-contract name) может быть подделано владельцем контракта, небезопасно как критерий для комплаенс-инструмента. Явно подтверждено пользователем как выбор (из трёх вариантов: только информация / полноценное стоп-условие / не делать вовсе) — выбрана первая, самая безопасная опция. Тесты выросли с 20 до 27 в test_bridge_tracer.py (105 → 116 в целом по репозиторию).</w:t>
       </w:r>
     </w:p>
     <w:sectPr>

</xml_diff>